<commit_message>
docx engine: update tester name, about blurb, and tools section
</commit_message>
<xml_diff>
--- a/public/templates/AIP Pentest Report - Engine Template .docx
+++ b/public/templates/AIP Pentest Report - Engine Template .docx
@@ -39,7 +39,7 @@
           <wp:anchor allowOverlap="1" behindDoc="1" distB="0" distT="0" distL="0" distR="0" hidden="0" layoutInCell="1" locked="0" relativeHeight="0" simplePos="0">
             <wp:simplePos x="0" y="0"/>
             <wp:positionH relativeFrom="page">
-              <wp:posOffset>-4759</wp:posOffset>
+              <wp:posOffset>-4758</wp:posOffset>
             </wp:positionH>
             <wp:positionV relativeFrom="page">
               <wp:posOffset>0</wp:posOffset>
@@ -47,12 +47,12 @@
             <wp:extent cx="7856371" cy="10163175"/>
             <wp:effectExtent b="0" l="0" r="0" t="0"/>
             <wp:wrapNone/>
-            <wp:docPr id="1" name="image3.jpg"/>
+            <wp:docPr id="4" name="image1.jpg"/>
             <a:graphic>
               <a:graphicData uri="http://schemas.openxmlformats.org/drawingml/2006/picture">
                 <pic:pic>
                   <pic:nvPicPr>
-                    <pic:cNvPr id="0" name="image3.jpg"/>
+                    <pic:cNvPr id="0" name="image1.jpg"/>
                     <pic:cNvPicPr preferRelativeResize="0"/>
                   </pic:nvPicPr>
                   <pic:blipFill>
@@ -1355,27 +1355,7 @@
     </w:p>
     <w:p>
       <w:pPr>
-        <w:ind w:left="1440" w:right="1440" w:firstLine="0"/>
-        <w:rPr>
-          <w:rFonts w:ascii="IBM Plex Sans" w:cs="IBM Plex Sans" w:eastAsia="IBM Plex Sans" w:hAnsi="IBM Plex Sans"/>
-          <w:sz w:val="28"/>
-          <w:szCs w:val="28"/>
-        </w:rPr>
-      </w:pPr>
-      <w:r>
-        <w:rPr>
-          <w:rFonts w:ascii="IBM Plex Sans" w:cs="IBM Plex Sans" w:eastAsia="IBM Plex Sans" w:hAnsi="IBM Plex Sans"/>
-          <w:sz w:val="28"/>
-          <w:szCs w:val="28"/>
-          <w:rtl w:val="0"/>
-        </w:rPr>
-        <w:t xml:space="preserve">This report is confidential and intended solely for authorized</w:t>
-      </w:r>
-    </w:p>
-    <w:p>
-      <w:pPr>
-        <w:spacing w:line="480" w:lineRule="auto"/>
-        <w:ind w:left="1440" w:right="1440" w:firstLine="0"/>
+        <w:ind w:left="-720" w:right="-720" w:firstLine="0"/>
         <w:jc w:val="center"/>
         <w:rPr>
           <w:rFonts w:ascii="IBM Plex Sans" w:cs="IBM Plex Sans" w:eastAsia="IBM Plex Sans" w:hAnsi="IBM Plex Sans"/>
@@ -1387,11 +1367,11 @@
       <w:r>
         <w:rPr>
           <w:rFonts w:ascii="IBM Plex Sans" w:cs="IBM Plex Sans" w:eastAsia="IBM Plex Sans" w:hAnsi="IBM Plex Sans"/>
-          <w:sz w:val="28"/>
-          <w:szCs w:val="28"/>
-          <w:rtl w:val="0"/>
-        </w:rPr>
-        <w:t xml:space="preserve">recipients.</w:t>
+          <w:sz w:val="26"/>
+          <w:szCs w:val="26"/>
+          <w:rtl w:val="0"/>
+        </w:rPr>
+        <w:t xml:space="preserve">This report is confidential and intended solely for authorized recipients.</w:t>
       </w:r>
       <w:r>
         <w:rPr>
@@ -1411,13 +1391,13 @@
             </wp:positionV>
             <wp:extent cx="5329238" cy="5334000"/>
             <wp:effectExtent b="0" l="0" r="0" t="0"/>
-            <wp:wrapSquare wrapText="bothSides" distB="114300" distT="114300" distL="114300" distR="114300"/>
-            <wp:docPr id="2" name="image2.png"/>
+            <wp:wrapNone/>
+            <wp:docPr id="5" name="image3.png"/>
             <a:graphic>
               <a:graphicData uri="http://schemas.openxmlformats.org/drawingml/2006/picture">
                 <pic:pic>
                   <pic:nvPicPr>
-                    <pic:cNvPr id="0" name="image2.png"/>
+                    <pic:cNvPr id="0" name="image3.png"/>
                     <pic:cNvPicPr preferRelativeResize="0"/>
                   </pic:nvPicPr>
                   <pic:blipFill>
@@ -1671,7 +1651,7 @@
                 <w:szCs w:val="24"/>
                 <w:rtl w:val="0"/>
               </w:rPr>
-              <w:t xml:space="preserve">AIP Hacker Agent</w:t>
+              <w:t xml:space="preserve">Zack ElMetennani</w:t>
             </w:r>
           </w:p>
         </w:tc>
@@ -1772,7 +1752,7 @@
     </w:p>
     <w:sdt>
       <w:sdtPr>
-        <w:id w:val="160914989"/>
+        <w:id w:val="2130644660"/>
         <w:docPartObj>
           <w:docPartGallery w:val="Table of Contents"/>
           <w:docPartUnique w:val="1"/>
@@ -1782,7 +1762,7 @@
         <w:p>
           <w:pPr>
             <w:tabs>
-              <w:tab w:val="right" w:leader="dot" w:pos="12000"/>
+              <w:tab w:val="right" w:leader="none" w:pos="12000"/>
             </w:tabs>
             <w:spacing w:before="60" w:lineRule="auto"/>
             <w:rPr>
@@ -1820,7 +1800,7 @@
         <w:p>
           <w:pPr>
             <w:tabs>
-              <w:tab w:val="right" w:leader="dot" w:pos="12000"/>
+              <w:tab w:val="right" w:leader="none" w:pos="12000"/>
             </w:tabs>
             <w:spacing w:before="60" w:lineRule="auto"/>
             <w:rPr>
@@ -1853,7 +1833,7 @@
         <w:p>
           <w:pPr>
             <w:tabs>
-              <w:tab w:val="right" w:leader="dot" w:pos="12000"/>
+              <w:tab w:val="right" w:leader="none" w:pos="12000"/>
             </w:tabs>
             <w:spacing w:before="60" w:lineRule="auto"/>
             <w:ind w:left="720" w:firstLine="0"/>
@@ -1883,7 +1863,7 @@
         <w:p>
           <w:pPr>
             <w:tabs>
-              <w:tab w:val="right" w:leader="dot" w:pos="12000"/>
+              <w:tab w:val="right" w:leader="none" w:pos="12000"/>
             </w:tabs>
             <w:spacing w:before="60" w:lineRule="auto"/>
             <w:rPr>
@@ -1916,7 +1896,7 @@
         <w:p>
           <w:pPr>
             <w:tabs>
-              <w:tab w:val="right" w:leader="dot" w:pos="12000"/>
+              <w:tab w:val="right" w:leader="none" w:pos="12000"/>
             </w:tabs>
             <w:spacing w:before="60" w:lineRule="auto"/>
             <w:rPr>
@@ -1949,7 +1929,7 @@
         <w:p>
           <w:pPr>
             <w:tabs>
-              <w:tab w:val="right" w:leader="dot" w:pos="12000"/>
+              <w:tab w:val="right" w:leader="none" w:pos="12000"/>
             </w:tabs>
             <w:spacing w:before="60" w:lineRule="auto"/>
             <w:rPr>
@@ -1982,7 +1962,7 @@
         <w:p>
           <w:pPr>
             <w:tabs>
-              <w:tab w:val="right" w:leader="dot" w:pos="12000"/>
+              <w:tab w:val="right" w:leader="none" w:pos="12000"/>
             </w:tabs>
             <w:spacing w:before="60" w:lineRule="auto"/>
             <w:ind w:left="360" w:firstLine="0"/>
@@ -2012,7 +1992,7 @@
         <w:p>
           <w:pPr>
             <w:tabs>
-              <w:tab w:val="right" w:leader="dot" w:pos="12000"/>
+              <w:tab w:val="right" w:leader="none" w:pos="12000"/>
             </w:tabs>
             <w:spacing w:before="60" w:lineRule="auto"/>
             <w:ind w:left="360" w:firstLine="0"/>
@@ -2042,7 +2022,7 @@
         <w:p>
           <w:pPr>
             <w:tabs>
-              <w:tab w:val="right" w:leader="dot" w:pos="12000"/>
+              <w:tab w:val="right" w:leader="none" w:pos="12000"/>
             </w:tabs>
             <w:spacing w:before="60" w:lineRule="auto"/>
             <w:ind w:left="360" w:firstLine="0"/>
@@ -2072,7 +2052,7 @@
         <w:p>
           <w:pPr>
             <w:tabs>
-              <w:tab w:val="right" w:leader="dot" w:pos="12000"/>
+              <w:tab w:val="right" w:leader="none" w:pos="12000"/>
             </w:tabs>
             <w:spacing w:before="60" w:lineRule="auto"/>
             <w:rPr>
@@ -2105,7 +2085,7 @@
         <w:p>
           <w:pPr>
             <w:tabs>
-              <w:tab w:val="right" w:leader="dot" w:pos="12000"/>
+              <w:tab w:val="right" w:leader="none" w:pos="12000"/>
             </w:tabs>
             <w:spacing w:before="60" w:lineRule="auto"/>
             <w:rPr>
@@ -2138,7 +2118,7 @@
         <w:p>
           <w:pPr>
             <w:tabs>
-              <w:tab w:val="right" w:leader="dot" w:pos="12000"/>
+              <w:tab w:val="right" w:leader="none" w:pos="12000"/>
             </w:tabs>
             <w:spacing w:before="60" w:lineRule="auto"/>
             <w:ind w:left="360" w:firstLine="0"/>
@@ -2193,7 +2173,7 @@
         <w:p>
           <w:pPr>
             <w:tabs>
-              <w:tab w:val="right" w:leader="dot" w:pos="12000"/>
+              <w:tab w:val="right" w:leader="none" w:pos="12000"/>
             </w:tabs>
             <w:spacing w:before="60" w:lineRule="auto"/>
             <w:rPr>
@@ -2226,7 +2206,7 @@
         <w:p>
           <w:pPr>
             <w:tabs>
-              <w:tab w:val="right" w:leader="dot" w:pos="12000"/>
+              <w:tab w:val="right" w:leader="none" w:pos="12000"/>
             </w:tabs>
             <w:spacing w:before="60" w:lineRule="auto"/>
             <w:ind w:left="360" w:firstLine="0"/>
@@ -2256,7 +2236,7 @@
         <w:p>
           <w:pPr>
             <w:tabs>
-              <w:tab w:val="right" w:leader="dot" w:pos="12000"/>
+              <w:tab w:val="right" w:leader="none" w:pos="12000"/>
             </w:tabs>
             <w:spacing w:before="60" w:lineRule="auto"/>
             <w:ind w:left="360" w:firstLine="0"/>
@@ -2331,6 +2311,463 @@
     </w:p>
     <w:p>
       <w:pPr>
+        <w:pStyle w:val="Heading1"/>
+        <w:spacing w:line="240" w:lineRule="auto"/>
+        <w:ind w:left="720" w:right="1440" w:firstLine="720"/>
+        <w:rPr>
+          <w:rFonts w:ascii="IBM Plex Sans" w:cs="IBM Plex Sans" w:eastAsia="IBM Plex Sans" w:hAnsi="IBM Plex Sans"/>
+          <w:color w:val="04092f"/>
+          <w:sz w:val="50"/>
+          <w:szCs w:val="50"/>
+        </w:rPr>
+      </w:pPr>
+      <w:bookmarkStart w:colFirst="0" w:colLast="0" w:name="_heading=h.flwqcdbs0kgw" w:id="1"/>
+      <w:bookmarkEnd w:id="1"/>
+      <w:r>
+        <w:rPr>
+          <w:rFonts w:ascii="IBM Plex Sans" w:cs="IBM Plex Sans" w:eastAsia="IBM Plex Sans" w:hAnsi="IBM Plex Sans"/>
+          <w:color w:val="064e3b"/>
+          <w:sz w:val="60"/>
+          <w:szCs w:val="60"/>
+          <w:rtl w:val="0"/>
+        </w:rPr>
+        <w:t xml:space="preserve">About Affordable Pentesting</w:t>
+      </w:r>
+      <w:r>
+        <w:rPr>
+          <w:rtl w:val="0"/>
+        </w:rPr>
+      </w:r>
+    </w:p>
+    <w:p>
+      <w:pPr>
+        <w:spacing w:after="240" w:before="240" w:lineRule="auto"/>
+        <w:rPr>
+          <w:rFonts w:ascii="IBM Plex Sans" w:cs="IBM Plex Sans" w:eastAsia="IBM Plex Sans" w:hAnsi="IBM Plex Sans"/>
+        </w:rPr>
+      </w:pPr>
+      <w:r>
+        <w:rPr>
+          <w:rFonts w:ascii="IBM Plex Sans" w:cs="IBM Plex Sans" w:eastAsia="IBM Plex Sans" w:hAnsi="IBM Plex Sans"/>
+          <w:rtl w:val="0"/>
+        </w:rPr>
+        <w:t xml:space="preserve">Security assessments should reflect how real attackers actually operate, not just what a scanner can find. At AffordablePentesting.com, we run in-depth penetration tests built for organizations that need genuine technical rigor, not a checkbox exercise.</w:t>
+      </w:r>
+    </w:p>
+    <w:p>
+      <w:pPr>
+        <w:ind w:left="720" w:right="1440" w:firstLine="720"/>
+        <w:rPr>
+          <w:rFonts w:ascii="IBM Plex Sans" w:cs="IBM Plex Sans" w:eastAsia="IBM Plex Sans" w:hAnsi="IBM Plex Sans"/>
+        </w:rPr>
+      </w:pPr>
+      <w:r>
+        <w:pict>
+          <v:rect style="width:0.0pt;height:1.5pt" o:hr="t" o:hrstd="t" o:hralign="center" fillcolor="#A0A0A0" stroked="f"/>
+        </w:pict>
+      </w:r>
+      <w:r>
+        <w:rPr>
+          <w:rtl w:val="0"/>
+        </w:rPr>
+      </w:r>
+    </w:p>
+    <w:p>
+      <w:pPr>
+        <w:spacing w:after="240" w:before="240" w:lineRule="auto"/>
+        <w:rPr>
+          <w:rFonts w:ascii="IBM Plex Sans" w:cs="IBM Plex Sans" w:eastAsia="IBM Plex Sans" w:hAnsi="IBM Plex Sans"/>
+        </w:rPr>
+      </w:pPr>
+      <w:r>
+        <w:rPr>
+          <w:rFonts w:ascii="IBM Plex Sans" w:cs="IBM Plex Sans" w:eastAsia="IBM Plex Sans" w:hAnsi="IBM Plex Sans"/>
+          <w:rtl w:val="0"/>
+        </w:rPr>
+        <w:t xml:space="preserve">Every finding within this document is vetted through a rigorous validation process. We don't just "run tools". Our methodology is built on three core pillars:</w:t>
+      </w:r>
+    </w:p>
+    <w:p>
+      <w:pPr>
+        <w:spacing w:after="240" w:before="240" w:lineRule="auto"/>
+        <w:ind w:left="0" w:firstLine="0"/>
+        <w:rPr>
+          <w:rFonts w:ascii="IBM Plex Sans" w:cs="IBM Plex Sans" w:eastAsia="IBM Plex Sans" w:hAnsi="IBM Plex Sans"/>
+        </w:rPr>
+      </w:pPr>
+      <w:r>
+        <w:rPr>
+          <w:rFonts w:ascii="IBM Plex Sans" w:cs="IBM Plex Sans" w:eastAsia="IBM Plex Sans" w:hAnsi="IBM Plex Sans"/>
+          <w:rtl w:val="0"/>
+        </w:rPr>
+        <w:t xml:space="preserve">• Human-Led, AI-Augmented Testing: Our analysts use AI-assisted tooling to accelerate reconnaissance and surface complex, multi-step attack chains that traditional scanners miss, but every result is manually verified for accuracy and real-world exploitability before it's reported.</w:t>
+      </w:r>
+    </w:p>
+    <w:p>
+      <w:pPr>
+        <w:spacing w:after="240" w:before="240" w:lineRule="auto"/>
+        <w:ind w:left="0" w:firstLine="0"/>
+        <w:rPr>
+          <w:rFonts w:ascii="IBM Plex Sans" w:cs="IBM Plex Sans" w:eastAsia="IBM Plex Sans" w:hAnsi="IBM Plex Sans"/>
+        </w:rPr>
+      </w:pPr>
+      <w:r>
+        <w:rPr>
+          <w:rFonts w:ascii="IBM Plex Sans" w:cs="IBM Plex Sans" w:eastAsia="IBM Plex Sans" w:hAnsi="IBM Plex Sans"/>
+          <w:rtl w:val="0"/>
+        </w:rPr>
+        <w:t xml:space="preserve">• Industry Standards: Our testing workflows are mapped to the OWASP Top 10, NIST SP 800-115, and PTES (Penetration Testing Execution Standard) frameworks.</w:t>
+      </w:r>
+    </w:p>
+    <w:p>
+      <w:pPr>
+        <w:spacing w:after="240" w:before="240" w:lineRule="auto"/>
+        <w:ind w:left="0" w:firstLine="0"/>
+        <w:rPr>
+          <w:rFonts w:ascii="IBM Plex Sans" w:cs="IBM Plex Sans" w:eastAsia="IBM Plex Sans" w:hAnsi="IBM Plex Sans"/>
+        </w:rPr>
+      </w:pPr>
+      <w:r>
+        <w:rPr>
+          <w:rFonts w:ascii="IBM Plex Sans" w:cs="IBM Plex Sans" w:eastAsia="IBM Plex Sans" w:hAnsi="IBM Plex Sans"/>
+          <w:rtl w:val="0"/>
+        </w:rPr>
+        <w:t xml:space="preserve">• Business-Aligned Risk Context: We evaluate findings against your specific business logic and environment, so remediation efforts stay focused on what actually threatens your operations, not theoretical risk.</w:t>
+      </w:r>
+    </w:p>
+    <w:p>
+      <w:pPr>
+        <w:spacing w:line="240" w:lineRule="auto"/>
+        <w:ind w:left="720" w:right="1440" w:firstLine="720"/>
+        <w:rPr>
+          <w:rFonts w:ascii="IBM Plex Sans" w:cs="IBM Plex Sans" w:eastAsia="IBM Plex Sans" w:hAnsi="IBM Plex Sans"/>
+        </w:rPr>
+      </w:pPr>
+      <w:r>
+        <w:pict>
+          <v:rect style="width:0.0pt;height:1.5pt" o:hr="t" o:hrstd="t" o:hralign="center" fillcolor="#A0A0A0" stroked="f"/>
+        </w:pict>
+      </w:r>
+      <w:r>
+        <w:rPr>
+          <w:rtl w:val="0"/>
+        </w:rPr>
+      </w:r>
+    </w:p>
+    <w:p>
+      <w:pPr>
+        <w:pStyle w:val="Heading3"/>
+        <w:spacing w:after="80" w:before="280" w:lineRule="auto"/>
+        <w:ind w:left="0" w:firstLine="0"/>
+        <w:rPr>
+          <w:rFonts w:ascii="IBM Plex Sans" w:cs="IBM Plex Sans" w:eastAsia="IBM Plex Sans" w:hAnsi="IBM Plex Sans"/>
+          <w:b w:val="1"/>
+          <w:bCs w:val="1"/>
+          <w:sz w:val="26"/>
+          <w:szCs w:val="26"/>
+        </w:rPr>
+      </w:pPr>
+      <w:bookmarkStart w:colFirst="0" w:colLast="0" w:name="_heading=h.e7uqmm3nyvmu" w:id="2"/>
+      <w:bookmarkEnd w:id="2"/>
+      <w:r>
+        <w:rPr>
+          <w:rFonts w:ascii="IBM Plex Sans" w:cs="IBM Plex Sans" w:eastAsia="IBM Plex Sans" w:hAnsi="IBM Plex Sans"/>
+          <w:b w:val="1"/>
+          <w:bCs w:val="1"/>
+          <w:sz w:val="26"/>
+          <w:szCs w:val="26"/>
+          <w:rtl w:val="0"/>
+        </w:rPr>
+        <w:t xml:space="preserve">Third-Party Attestation Statement</w:t>
+      </w:r>
+    </w:p>
+    <w:p>
+      <w:pPr>
+        <w:spacing w:after="240" w:before="240" w:lineRule="auto"/>
+        <w:rPr>
+          <w:rFonts w:ascii="IBM Plex Sans" w:cs="IBM Plex Sans" w:eastAsia="IBM Plex Sans" w:hAnsi="IBM Plex Sans"/>
+        </w:rPr>
+      </w:pPr>
+      <w:r>
+        <w:rPr>
+          <w:rFonts w:ascii="IBM Plex Sans" w:cs="IBM Plex Sans" w:eastAsia="IBM Plex Sans" w:hAnsi="IBM Plex Sans"/>
+          <w:b w:val="1"/>
+          <w:bCs w:val="1"/>
+          <w:rtl w:val="0"/>
+        </w:rPr>
+        <w:t xml:space="preserve">Affordable Pentesting</w:t>
+      </w:r>
+      <w:r>
+        <w:rPr>
+          <w:rFonts w:ascii="IBM Plex Sans" w:cs="IBM Plex Sans" w:eastAsia="IBM Plex Sans" w:hAnsi="IBM Plex Sans"/>
+          <w:rtl w:val="0"/>
+        </w:rPr>
+        <w:t xml:space="preserve"> attests that the security assessment documented in this report was conducted using industry standard cybersecurity testing methodologies. This engagement was performed independently to identify, validate, and categorize security vulnerabilities within the defined scope.</w:t>
+      </w:r>
+    </w:p>
+    <w:p>
+      <w:pPr>
+        <w:spacing w:after="240" w:before="240" w:lineRule="auto"/>
+        <w:rPr>
+          <w:rFonts w:ascii="IBM Plex Sans" w:cs="IBM Plex Sans" w:eastAsia="IBM Plex Sans" w:hAnsi="IBM Plex Sans"/>
+        </w:rPr>
+      </w:pPr>
+      <w:r>
+        <w:rPr>
+          <w:rFonts w:ascii="IBM Plex Sans" w:cs="IBM Plex Sans" w:eastAsia="IBM Plex Sans" w:hAnsi="IBM Plex Sans"/>
+          <w:rtl w:val="0"/>
+        </w:rPr>
+        <w:t xml:space="preserve">The findings herein represent a rigorous, point-in-time evaluation of the target environment's resilience against modern adversarial tactics. This statement serves as formal verification for stakeholders, partners, and regulatory bodies that {{CLIENT_NAME}} has undergone professional third-party security validation.</w:t>
+      </w:r>
+    </w:p>
+    <w:p>
+      <w:pPr>
+        <w:shd w:fill="ffffff" w:val="clear"/>
+        <w:spacing w:line="240" w:lineRule="auto"/>
+        <w:ind w:left="720" w:right="1440" w:firstLine="0"/>
+        <w:jc w:val="left"/>
+        <w:rPr>
+          <w:rFonts w:ascii="IBM Plex Sans" w:cs="IBM Plex Sans" w:eastAsia="IBM Plex Sans" w:hAnsi="IBM Plex Sans"/>
+        </w:rPr>
+      </w:pPr>
+      <w:r>
+        <w:rPr>
+          <w:rFonts w:ascii="IBM Plex Sans" w:cs="IBM Plex Sans" w:eastAsia="IBM Plex Sans" w:hAnsi="IBM Plex Sans"/>
+          <w:rtl w:val="0"/>
+        </w:rPr>
+        <w:t xml:space="preserve">Zack ElMetennani</w:t>
+      </w:r>
+    </w:p>
+    <w:p>
+      <w:pPr>
+        <w:shd w:fill="ffffff" w:val="clear"/>
+        <w:spacing w:line="240" w:lineRule="auto"/>
+        <w:ind w:left="720" w:right="1440" w:firstLine="0"/>
+        <w:jc w:val="left"/>
+        <w:rPr>
+          <w:rFonts w:ascii="IBM Plex Sans" w:cs="IBM Plex Sans" w:eastAsia="IBM Plex Sans" w:hAnsi="IBM Plex Sans"/>
+        </w:rPr>
+      </w:pPr>
+      <w:r>
+        <w:rPr>
+          <w:rFonts w:ascii="IBM Plex Sans" w:cs="IBM Plex Sans" w:eastAsia="IBM Plex Sans" w:hAnsi="IBM Plex Sans"/>
+          <w:rtl w:val="0"/>
+        </w:rPr>
+        <w:t xml:space="preserve">Security Lead</w:t>
+      </w:r>
+    </w:p>
+    <w:p>
+      <w:pPr>
+        <w:shd w:fill="ffffff" w:val="clear"/>
+        <w:spacing w:line="240" w:lineRule="auto"/>
+        <w:ind w:left="720" w:right="1440" w:firstLine="0"/>
+        <w:jc w:val="left"/>
+        <w:rPr>
+          <w:rFonts w:ascii="IBM Plex Sans" w:cs="IBM Plex Sans" w:eastAsia="IBM Plex Sans" w:hAnsi="IBM Plex Sans"/>
+        </w:rPr>
+      </w:pPr>
+      <w:r>
+        <w:rPr>
+          <w:rFonts w:ascii="IBM Plex Sans" w:cs="IBM Plex Sans" w:eastAsia="IBM Plex Sans" w:hAnsi="IBM Plex Sans"/>
+          <w:rtl w:val="0"/>
+        </w:rPr>
+        <w:t xml:space="preserve">zack@affordablepentesting.com</w:t>
+      </w:r>
+    </w:p>
+    <w:p>
+      <w:pPr>
+        <w:shd w:fill="ffffff" w:val="clear"/>
+        <w:spacing w:line="240" w:lineRule="auto"/>
+        <w:ind w:left="720" w:right="1440" w:firstLine="0"/>
+        <w:jc w:val="left"/>
+        <w:rPr>
+          <w:rFonts w:ascii="IBM Plex Sans" w:cs="IBM Plex Sans" w:eastAsia="IBM Plex Sans" w:hAnsi="IBM Plex Sans"/>
+        </w:rPr>
+      </w:pPr>
+      <w:hyperlink r:id="rId10">
+        <w:r>
+          <w:rPr>
+            <w:rFonts w:ascii="IBM Plex Sans" w:cs="IBM Plex Sans" w:eastAsia="IBM Plex Sans" w:hAnsi="IBM Plex Sans"/>
+            <w:color w:val="1155cc"/>
+            <w:u w:val="single"/>
+            <w:rtl w:val="0"/>
+          </w:rPr>
+          <w:t xml:space="preserve">Affordable Pentesting</w:t>
+        </w:r>
+      </w:hyperlink>
+      <w:r>
+        <w:rPr>
+          <w:rtl w:val="0"/>
+        </w:rPr>
+      </w:r>
+    </w:p>
+    <w:p>
+      <w:pPr>
+        <w:pStyle w:val="Heading1"/>
+        <w:shd w:fill="ffffff" w:val="clear"/>
+        <w:spacing w:line="240" w:lineRule="auto"/>
+        <w:ind w:left="720" w:right="1440" w:firstLine="0"/>
+        <w:jc w:val="left"/>
+        <w:rPr>
+          <w:rFonts w:ascii="Arial" w:cs="Arial" w:eastAsia="Arial" w:hAnsi="Arial"/>
+          <w:color w:val="222222"/>
+          <w:sz w:val="22"/>
+          <w:szCs w:val="22"/>
+        </w:rPr>
+      </w:pPr>
+      <w:bookmarkStart w:colFirst="0" w:colLast="0" w:name="_heading=h.b911in3epikb" w:id="3"/>
+      <w:bookmarkEnd w:id="3"/>
+      <w:r>
+        <w:rPr>
+          <w:rtl w:val="0"/>
+        </w:rPr>
+      </w:r>
+    </w:p>
+    <w:p>
+      <w:pPr>
+        <w:pStyle w:val="Heading1"/>
+        <w:shd w:fill="ffffff" w:val="clear"/>
+        <w:spacing w:line="240" w:lineRule="auto"/>
+        <w:ind w:left="720" w:right="1440" w:firstLine="0"/>
+        <w:jc w:val="left"/>
+        <w:rPr>
+          <w:rFonts w:ascii="IBM Plex Sans" w:cs="IBM Plex Sans" w:eastAsia="IBM Plex Sans" w:hAnsi="IBM Plex Sans"/>
+          <w:color w:val="064e3b"/>
+        </w:rPr>
+      </w:pPr>
+      <w:bookmarkStart w:colFirst="0" w:colLast="0" w:name="_heading=h.yvau2frrheup" w:id="4"/>
+      <w:bookmarkEnd w:id="4"/>
+      <w:r>
+        <w:rPr>
+          <w:rFonts w:ascii="Arial" w:cs="Arial" w:eastAsia="Arial" w:hAnsi="Arial"/>
+          <w:color w:val="222222"/>
+          <w:sz w:val="22"/>
+          <w:szCs w:val="22"/>
+        </w:rPr>
+        <w:drawing>
+          <wp:inline distB="114300" distT="114300" distL="114300" distR="114300">
+            <wp:extent cx="928688" cy="928688"/>
+            <wp:effectExtent b="0" l="0" r="0" t="0"/>
+            <wp:docPr id="6" name="image2.png"/>
+            <a:graphic>
+              <a:graphicData uri="http://schemas.openxmlformats.org/drawingml/2006/picture">
+                <pic:pic>
+                  <pic:nvPicPr>
+                    <pic:cNvPr id="0" name="image2.png"/>
+                    <pic:cNvPicPr preferRelativeResize="0"/>
+                  </pic:nvPicPr>
+                  <pic:blipFill>
+                    <a:blip r:embed="rId11"/>
+                    <a:srcRect b="0" l="0" r="0" t="0"/>
+                    <a:stretch>
+                      <a:fillRect/>
+                    </a:stretch>
+                  </pic:blipFill>
+                  <pic:spPr>
+                    <a:xfrm>
+                      <a:off x="0" y="0"/>
+                      <a:ext cx="928688" cy="928688"/>
+                    </a:xfrm>
+                    <a:prstGeom prst="rect"/>
+                    <a:ln/>
+                  </pic:spPr>
+                </pic:pic>
+              </a:graphicData>
+            </a:graphic>
+          </wp:inline>
+        </w:drawing>
+      </w:r>
+      <w:r>
+        <w:br w:type="page"/>
+      </w:r>
+      <w:r>
+        <w:rPr>
+          <w:rtl w:val="0"/>
+        </w:rPr>
+      </w:r>
+    </w:p>
+    <w:p>
+      <w:pPr>
+        <w:pStyle w:val="Heading1"/>
+        <w:spacing w:line="240" w:lineRule="auto"/>
+        <w:ind w:left="1440" w:right="1440" w:firstLine="0"/>
+        <w:rPr>
+          <w:rFonts w:ascii="IBM Plex Sans" w:cs="IBM Plex Sans" w:eastAsia="IBM Plex Sans" w:hAnsi="IBM Plex Sans"/>
+        </w:rPr>
+      </w:pPr>
+      <w:bookmarkStart w:colFirst="0" w:colLast="0" w:name="_heading=h.3lip5046076p" w:id="5"/>
+      <w:bookmarkEnd w:id="5"/>
+      <w:r>
+        <w:rPr>
+          <w:rFonts w:ascii="IBM Plex Sans" w:cs="IBM Plex Sans" w:eastAsia="IBM Plex Sans" w:hAnsi="IBM Plex Sans"/>
+          <w:color w:val="064e3b"/>
+          <w:rtl w:val="0"/>
+        </w:rPr>
+        <w:t xml:space="preserve">Executive Summary</w:t>
+      </w:r>
+      <w:r>
+        <w:rPr>
+          <w:rtl w:val="0"/>
+        </w:rPr>
+      </w:r>
+    </w:p>
+    <w:p>
+      <w:pPr>
+        <w:tabs>
+          <w:tab w:val="left" w:leader="none" w:pos="1440"/>
+        </w:tabs>
+        <w:spacing w:before="12" w:line="276" w:lineRule="auto"/>
+        <w:ind w:left="0" w:right="1440" w:firstLine="0"/>
+        <w:jc w:val="left"/>
+        <w:rPr>
+          <w:rFonts w:ascii="IBM Plex Sans" w:cs="IBM Plex Sans" w:eastAsia="IBM Plex Sans" w:hAnsi="IBM Plex Sans"/>
+        </w:rPr>
+      </w:pPr>
+      <w:r>
+        <w:rPr>
+          <w:rtl w:val="0"/>
+        </w:rPr>
+      </w:r>
+    </w:p>
+    <w:p>
+      <w:pPr>
+        <w:tabs>
+          <w:tab w:val="left" w:leader="none" w:pos="1440"/>
+        </w:tabs>
+        <w:spacing w:before="12" w:line="276" w:lineRule="auto"/>
+        <w:ind w:left="0" w:right="1440" w:firstLine="0"/>
+        <w:jc w:val="left"/>
+        <w:rPr>
+          <w:rFonts w:ascii="IBM Plex Sans" w:cs="IBM Plex Sans" w:eastAsia="IBM Plex Sans" w:hAnsi="IBM Plex Sans"/>
+        </w:rPr>
+      </w:pPr>
+      <w:r>
+        <w:rPr>
+          <w:rtl w:val="0"/>
+        </w:rPr>
+      </w:r>
+    </w:p>
+    <w:p>
+      <w:pPr>
+        <w:tabs>
+          <w:tab w:val="left" w:leader="none" w:pos="1440"/>
+        </w:tabs>
+        <w:spacing w:before="12" w:line="276" w:lineRule="auto"/>
+        <w:ind w:left="1440" w:right="1440" w:firstLine="0"/>
+        <w:rPr>
+          <w:rFonts w:ascii="IBM Plex Sans" w:cs="IBM Plex Sans" w:eastAsia="IBM Plex Sans" w:hAnsi="IBM Plex Sans"/>
+        </w:rPr>
+      </w:pPr>
+      <w:r>
+        <w:rPr>
+          <w:rFonts w:ascii="IBM Plex Sans" w:cs="IBM Plex Sans" w:eastAsia="IBM Plex Sans" w:hAnsi="IBM Plex Sans"/>
+          <w:rtl w:val="0"/>
+        </w:rPr>
+        <w:t xml:space="preserve">{{EXECUTIVE_SUMMARY}}</w:t>
+      </w:r>
+    </w:p>
+    <w:p>
+      <w:pPr>
         <w:keepNext w:val="0"/>
         <w:keepLines w:val="0"/>
         <w:pageBreakBefore w:val="0"/>
@@ -2367,409 +2804,6 @@
     </w:p>
     <w:p>
       <w:pPr>
-        <w:pStyle w:val="Heading1"/>
-        <w:spacing w:line="240" w:lineRule="auto"/>
-        <w:ind w:left="720" w:right="1440" w:firstLine="720"/>
-        <w:rPr>
-          <w:rFonts w:ascii="IBM Plex Sans" w:cs="IBM Plex Sans" w:eastAsia="IBM Plex Sans" w:hAnsi="IBM Plex Sans"/>
-          <w:color w:val="04092f"/>
-          <w:sz w:val="50"/>
-          <w:szCs w:val="50"/>
-        </w:rPr>
-      </w:pPr>
-      <w:bookmarkStart w:colFirst="0" w:colLast="0" w:name="_heading=h.flwqcdbs0kgw" w:id="1"/>
-      <w:bookmarkEnd w:id="1"/>
-      <w:r>
-        <w:rPr>
-          <w:rFonts w:ascii="IBM Plex Sans" w:cs="IBM Plex Sans" w:eastAsia="IBM Plex Sans" w:hAnsi="IBM Plex Sans"/>
-          <w:color w:val="064e3b"/>
-          <w:sz w:val="60"/>
-          <w:szCs w:val="60"/>
-          <w:rtl w:val="0"/>
-        </w:rPr>
-        <w:t xml:space="preserve">About Affordable Pentesting</w:t>
-      </w:r>
-      <w:r>
-        <w:rPr>
-          <w:rtl w:val="0"/>
-        </w:rPr>
-      </w:r>
-    </w:p>
-    <w:p>
-      <w:pPr>
-        <w:spacing w:after="240" w:before="240" w:line="240" w:lineRule="auto"/>
-        <w:ind w:left="1440" w:right="1440" w:firstLine="0"/>
-        <w:rPr>
-          <w:rFonts w:ascii="IBM Plex Sans" w:cs="IBM Plex Sans" w:eastAsia="IBM Plex Sans" w:hAnsi="IBM Plex Sans"/>
-        </w:rPr>
-      </w:pPr>
-      <w:r>
-        <w:rPr>
-          <w:rFonts w:ascii="IBM Plex Sans" w:cs="IBM Plex Sans" w:eastAsia="IBM Plex Sans" w:hAnsi="IBM Plex Sans"/>
-          <w:rtl w:val="0"/>
-        </w:rPr>
-        <w:t xml:space="preserve">AffordablePentesting.com delivers manual-grade security assessments powered by AI. Every finding is validated against real exploitability, not just scan output. Our methodology maps to OWASP, NIST, and PTES standards - we just run it faster. The result is a clear, prioritized list of what's actually broken and how to fix it.</w:t>
-      </w:r>
-      <w:r>
-        <w:rPr>
-          <w:rtl w:val="0"/>
-        </w:rPr>
-      </w:r>
-    </w:p>
-    <w:p>
-      <w:pPr>
-        <w:spacing w:after="240" w:before="240" w:line="240" w:lineRule="auto"/>
-        <w:ind w:left="1440" w:right="1440" w:firstLine="0"/>
-        <w:rPr>
-          <w:rFonts w:ascii="IBM Plex Sans" w:cs="IBM Plex Sans" w:eastAsia="IBM Plex Sans" w:hAnsi="IBM Plex Sans"/>
-        </w:rPr>
-      </w:pPr>
-      <w:r>
-        <w:rPr>
-          <w:rFonts w:ascii="IBM Plex Sans" w:cs="IBM Plex Sans" w:eastAsia="IBM Plex Sans" w:hAnsi="IBM Plex Sans"/>
-          <w:rtl w:val="0"/>
-        </w:rPr>
-        <w:t xml:space="preserve">We test your app the same way a human pentester would, but at machine speed. Our AI agents find vulnerabilities, validate them with proof-of-concept exploits, and filter out the noise. What you get is a report focused on what matters: the real risks to your business.</w:t>
-      </w:r>
-      <w:r>
-        <w:rPr>
-          <w:rtl w:val="0"/>
-        </w:rPr>
-      </w:r>
-    </w:p>
-    <w:p>
-      <w:pPr>
-        <w:spacing w:line="240" w:lineRule="auto"/>
-        <w:ind w:left="720" w:right="1440" w:firstLine="720"/>
-        <w:rPr>
-          <w:rFonts w:ascii="IBM Plex Sans" w:cs="IBM Plex Sans" w:eastAsia="IBM Plex Sans" w:hAnsi="IBM Plex Sans"/>
-        </w:rPr>
-      </w:pPr>
-      <w:r>
-        <w:pict>
-          <v:rect style="width:0.0pt;height:1.5pt" o:hr="t" o:hrstd="t" o:hralign="center" fillcolor="#A0A0A0" stroked="f"/>
-        </w:pict>
-      </w:r>
-      <w:r>
-        <w:rPr>
-          <w:rtl w:val="0"/>
-        </w:rPr>
-      </w:r>
-    </w:p>
-    <w:p>
-      <w:pPr>
-        <w:pStyle w:val="Heading3"/>
-        <w:spacing w:after="80" w:before="280" w:lineRule="auto"/>
-        <w:ind w:left="0" w:firstLine="0"/>
-        <w:rPr>
-          <w:rFonts w:ascii="IBM Plex Sans" w:cs="IBM Plex Sans" w:eastAsia="IBM Plex Sans" w:hAnsi="IBM Plex Sans"/>
-          <w:b w:val="1"/>
-          <w:bCs w:val="1"/>
-          <w:sz w:val="26"/>
-          <w:szCs w:val="26"/>
-        </w:rPr>
-      </w:pPr>
-      <w:bookmarkStart w:colFirst="0" w:colLast="0" w:name="_heading=h.e7uqmm3nyvmu" w:id="2"/>
-      <w:bookmarkEnd w:id="2"/>
-      <w:r>
-        <w:rPr>
-          <w:rFonts w:ascii="IBM Plex Sans" w:cs="IBM Plex Sans" w:eastAsia="IBM Plex Sans" w:hAnsi="IBM Plex Sans"/>
-          <w:b w:val="1"/>
-          <w:bCs w:val="1"/>
-          <w:sz w:val="26"/>
-          <w:szCs w:val="26"/>
-          <w:rtl w:val="0"/>
-        </w:rPr>
-        <w:t xml:space="preserve">Third-Party Attestation Statement</w:t>
-      </w:r>
-    </w:p>
-    <w:p>
-      <w:pPr>
-        <w:spacing w:after="240" w:before="240" w:lineRule="auto"/>
-        <w:rPr>
-          <w:rFonts w:ascii="IBM Plex Sans" w:cs="IBM Plex Sans" w:eastAsia="IBM Plex Sans" w:hAnsi="IBM Plex Sans"/>
-        </w:rPr>
-      </w:pPr>
-      <w:r>
-        <w:rPr>
-          <w:rFonts w:ascii="IBM Plex Sans" w:cs="IBM Plex Sans" w:eastAsia="IBM Plex Sans" w:hAnsi="IBM Plex Sans"/>
-          <w:b w:val="1"/>
-          <w:bCs w:val="1"/>
-          <w:rtl w:val="0"/>
-        </w:rPr>
-        <w:t xml:space="preserve">Affordable Pentesting</w:t>
-      </w:r>
-      <w:r>
-        <w:rPr>
-          <w:rFonts w:ascii="IBM Plex Sans" w:cs="IBM Plex Sans" w:eastAsia="IBM Plex Sans" w:hAnsi="IBM Plex Sans"/>
-          <w:rtl w:val="0"/>
-        </w:rPr>
-        <w:t xml:space="preserve"> attests that the security assessment documented in this report was conducted using industry standard cybersecurity testing methodologies. This engagement was performed independently to identify, validate, and categorize security vulnerabilities within the defined scope.</w:t>
-      </w:r>
-    </w:p>
-    <w:p>
-      <w:pPr>
-        <w:spacing w:after="240" w:before="240" w:lineRule="auto"/>
-        <w:rPr>
-          <w:rFonts w:ascii="IBM Plex Sans" w:cs="IBM Plex Sans" w:eastAsia="IBM Plex Sans" w:hAnsi="IBM Plex Sans"/>
-        </w:rPr>
-      </w:pPr>
-      <w:r>
-        <w:rPr>
-          <w:rFonts w:ascii="IBM Plex Sans" w:cs="IBM Plex Sans" w:eastAsia="IBM Plex Sans" w:hAnsi="IBM Plex Sans"/>
-          <w:rtl w:val="0"/>
-        </w:rPr>
-        <w:t xml:space="preserve">The findings herein represent a rigorous, point-in-time evaluation of the target environment's resilience against modern adversarial tactics. This statement serves as formal verification for stakeholders, partners, and regulatory bodies that {{CLIENT_NAME}} has undergone professional third-party security validation.</w:t>
-      </w:r>
-    </w:p>
-    <w:p>
-      <w:pPr>
-        <w:shd w:fill="ffffff" w:val="clear"/>
-        <w:spacing w:line="240" w:lineRule="auto"/>
-        <w:ind w:left="720" w:right="1440" w:firstLine="0"/>
-        <w:jc w:val="left"/>
-        <w:rPr>
-          <w:rFonts w:ascii="IBM Plex Sans" w:cs="IBM Plex Sans" w:eastAsia="IBM Plex Sans" w:hAnsi="IBM Plex Sans"/>
-        </w:rPr>
-      </w:pPr>
-      <w:r>
-        <w:rPr>
-          <w:rFonts w:ascii="IBM Plex Sans" w:cs="IBM Plex Sans" w:eastAsia="IBM Plex Sans" w:hAnsi="IBM Plex Sans"/>
-          <w:rtl w:val="0"/>
-        </w:rPr>
-        <w:t xml:space="preserve">Zack ElMetennani</w:t>
-      </w:r>
-    </w:p>
-    <w:p>
-      <w:pPr>
-        <w:shd w:fill="ffffff" w:val="clear"/>
-        <w:spacing w:line="240" w:lineRule="auto"/>
-        <w:ind w:left="720" w:right="1440" w:firstLine="0"/>
-        <w:jc w:val="left"/>
-        <w:rPr>
-          <w:rFonts w:ascii="IBM Plex Sans" w:cs="IBM Plex Sans" w:eastAsia="IBM Plex Sans" w:hAnsi="IBM Plex Sans"/>
-        </w:rPr>
-      </w:pPr>
-      <w:r>
-        <w:rPr>
-          <w:rFonts w:ascii="IBM Plex Sans" w:cs="IBM Plex Sans" w:eastAsia="IBM Plex Sans" w:hAnsi="IBM Plex Sans"/>
-          <w:rtl w:val="0"/>
-        </w:rPr>
-        <w:t xml:space="preserve">Security Lead</w:t>
-      </w:r>
-    </w:p>
-    <w:p>
-      <w:pPr>
-        <w:shd w:fill="ffffff" w:val="clear"/>
-        <w:spacing w:line="240" w:lineRule="auto"/>
-        <w:ind w:left="720" w:right="1440" w:firstLine="0"/>
-        <w:jc w:val="left"/>
-        <w:rPr>
-          <w:rFonts w:ascii="IBM Plex Sans" w:cs="IBM Plex Sans" w:eastAsia="IBM Plex Sans" w:hAnsi="IBM Plex Sans"/>
-        </w:rPr>
-      </w:pPr>
-      <w:r>
-        <w:rPr>
-          <w:rFonts w:ascii="IBM Plex Sans" w:cs="IBM Plex Sans" w:eastAsia="IBM Plex Sans" w:hAnsi="IBM Plex Sans"/>
-          <w:rtl w:val="0"/>
-        </w:rPr>
-        <w:t xml:space="preserve">zack@affordablepentesting.com</w:t>
-      </w:r>
-    </w:p>
-    <w:p>
-      <w:pPr>
-        <w:shd w:fill="ffffff" w:val="clear"/>
-        <w:spacing w:line="240" w:lineRule="auto"/>
-        <w:ind w:left="720" w:right="1440" w:firstLine="0"/>
-        <w:jc w:val="left"/>
-        <w:rPr>
-          <w:rFonts w:ascii="IBM Plex Sans" w:cs="IBM Plex Sans" w:eastAsia="IBM Plex Sans" w:hAnsi="IBM Plex Sans"/>
-        </w:rPr>
-      </w:pPr>
-      <w:hyperlink r:id="rId10">
-        <w:r>
-          <w:rPr>
-            <w:rFonts w:ascii="IBM Plex Sans" w:cs="IBM Plex Sans" w:eastAsia="IBM Plex Sans" w:hAnsi="IBM Plex Sans"/>
-            <w:color w:val="1155cc"/>
-            <w:u w:val="single"/>
-            <w:rtl w:val="0"/>
-          </w:rPr>
-          <w:t xml:space="preserve">Affordable Pentesting</w:t>
-        </w:r>
-      </w:hyperlink>
-      <w:r>
-        <w:rPr>
-          <w:rtl w:val="0"/>
-        </w:rPr>
-      </w:r>
-    </w:p>
-    <w:p>
-      <w:pPr>
-        <w:pStyle w:val="Heading1"/>
-        <w:shd w:fill="ffffff" w:val="clear"/>
-        <w:spacing w:line="240" w:lineRule="auto"/>
-        <w:ind w:left="720" w:right="1440" w:firstLine="0"/>
-        <w:jc w:val="left"/>
-        <w:rPr>
-          <w:rFonts w:ascii="Arial" w:cs="Arial" w:eastAsia="Arial" w:hAnsi="Arial"/>
-          <w:color w:val="222222"/>
-          <w:sz w:val="22"/>
-          <w:szCs w:val="22"/>
-        </w:rPr>
-      </w:pPr>
-      <w:bookmarkStart w:colFirst="0" w:colLast="0" w:name="_heading=h.b911in3epikb" w:id="3"/>
-      <w:bookmarkEnd w:id="3"/>
-      <w:r>
-        <w:rPr>
-          <w:rtl w:val="0"/>
-        </w:rPr>
-      </w:r>
-    </w:p>
-    <w:p>
-      <w:pPr>
-        <w:pStyle w:val="Heading1"/>
-        <w:shd w:fill="ffffff" w:val="clear"/>
-        <w:spacing w:line="240" w:lineRule="auto"/>
-        <w:ind w:left="720" w:right="1440" w:firstLine="0"/>
-        <w:jc w:val="left"/>
-        <w:rPr>
-          <w:rFonts w:ascii="IBM Plex Sans" w:cs="IBM Plex Sans" w:eastAsia="IBM Plex Sans" w:hAnsi="IBM Plex Sans"/>
-          <w:color w:val="064e3b"/>
-        </w:rPr>
-      </w:pPr>
-      <w:bookmarkStart w:colFirst="0" w:colLast="0" w:name="_heading=h.yvau2frrheup" w:id="4"/>
-      <w:bookmarkEnd w:id="4"/>
-      <w:r>
-        <w:rPr>
-          <w:rFonts w:ascii="Arial" w:cs="Arial" w:eastAsia="Arial" w:hAnsi="Arial"/>
-          <w:color w:val="222222"/>
-          <w:sz w:val="22"/>
-          <w:szCs w:val="22"/>
-        </w:rPr>
-        <w:drawing>
-          <wp:inline distB="114300" distT="114300" distL="114300" distR="114300">
-            <wp:extent cx="928688" cy="928688"/>
-            <wp:effectExtent b="0" l="0" r="0" t="0"/>
-            <wp:docPr id="3" name="image1.png"/>
-            <a:graphic>
-              <a:graphicData uri="http://schemas.openxmlformats.org/drawingml/2006/picture">
-                <pic:pic>
-                  <pic:nvPicPr>
-                    <pic:cNvPr id="0" name="image1.png"/>
-                    <pic:cNvPicPr preferRelativeResize="0"/>
-                  </pic:nvPicPr>
-                  <pic:blipFill>
-                    <a:blip r:embed="rId11"/>
-                    <a:srcRect b="0" l="0" r="0" t="0"/>
-                    <a:stretch>
-                      <a:fillRect/>
-                    </a:stretch>
-                  </pic:blipFill>
-                  <pic:spPr>
-                    <a:xfrm>
-                      <a:off x="0" y="0"/>
-                      <a:ext cx="928688" cy="928688"/>
-                    </a:xfrm>
-                    <a:prstGeom prst="rect"/>
-                    <a:ln/>
-                  </pic:spPr>
-                </pic:pic>
-              </a:graphicData>
-            </a:graphic>
-          </wp:inline>
-        </w:drawing>
-      </w:r>
-      <w:r>
-        <w:br w:type="page"/>
-      </w:r>
-      <w:r>
-        <w:rPr>
-          <w:rtl w:val="0"/>
-        </w:rPr>
-      </w:r>
-    </w:p>
-    <w:p>
-      <w:pPr>
-        <w:pStyle w:val="Heading1"/>
-        <w:spacing w:line="240" w:lineRule="auto"/>
-        <w:ind w:left="1440" w:right="1440" w:firstLine="0"/>
-        <w:rPr>
-          <w:rFonts w:ascii="IBM Plex Sans" w:cs="IBM Plex Sans" w:eastAsia="IBM Plex Sans" w:hAnsi="IBM Plex Sans"/>
-        </w:rPr>
-      </w:pPr>
-      <w:bookmarkStart w:colFirst="0" w:colLast="0" w:name="_heading=h.3lip5046076p" w:id="5"/>
-      <w:bookmarkEnd w:id="5"/>
-      <w:r>
-        <w:rPr>
-          <w:rFonts w:ascii="IBM Plex Sans" w:cs="IBM Plex Sans" w:eastAsia="IBM Plex Sans" w:hAnsi="IBM Plex Sans"/>
-          <w:color w:val="064e3b"/>
-          <w:rtl w:val="0"/>
-        </w:rPr>
-        <w:t xml:space="preserve">Executive Summary</w:t>
-      </w:r>
-      <w:r>
-        <w:rPr>
-          <w:rtl w:val="0"/>
-        </w:rPr>
-      </w:r>
-    </w:p>
-    <w:p>
-      <w:pPr>
-        <w:tabs>
-          <w:tab w:val="left" w:leader="none" w:pos="1440"/>
-        </w:tabs>
-        <w:spacing w:before="12" w:line="276" w:lineRule="auto"/>
-        <w:ind w:left="0" w:right="1440" w:firstLine="0"/>
-        <w:jc w:val="left"/>
-        <w:rPr>
-          <w:rFonts w:ascii="IBM Plex Sans" w:cs="IBM Plex Sans" w:eastAsia="IBM Plex Sans" w:hAnsi="IBM Plex Sans"/>
-        </w:rPr>
-      </w:pPr>
-      <w:r>
-        <w:rPr>
-          <w:rtl w:val="0"/>
-        </w:rPr>
-      </w:r>
-    </w:p>
-    <w:p>
-      <w:pPr>
-        <w:tabs>
-          <w:tab w:val="left" w:leader="none" w:pos="1440"/>
-        </w:tabs>
-        <w:spacing w:before="12" w:line="276" w:lineRule="auto"/>
-        <w:ind w:left="0" w:right="1440" w:firstLine="0"/>
-        <w:jc w:val="left"/>
-        <w:rPr>
-          <w:rFonts w:ascii="IBM Plex Sans" w:cs="IBM Plex Sans" w:eastAsia="IBM Plex Sans" w:hAnsi="IBM Plex Sans"/>
-        </w:rPr>
-      </w:pPr>
-      <w:r>
-        <w:rPr>
-          <w:rtl w:val="0"/>
-        </w:rPr>
-      </w:r>
-    </w:p>
-    <w:p>
-      <w:pPr>
-        <w:tabs>
-          <w:tab w:val="left" w:leader="none" w:pos="1440"/>
-        </w:tabs>
-        <w:spacing w:before="12" w:line="276" w:lineRule="auto"/>
-        <w:ind w:left="1440" w:right="1440" w:firstLine="0"/>
-        <w:rPr>
-          <w:rFonts w:ascii="IBM Plex Sans" w:cs="IBM Plex Sans" w:eastAsia="IBM Plex Sans" w:hAnsi="IBM Plex Sans"/>
-        </w:rPr>
-      </w:pPr>
-      <w:r>
-        <w:rPr>
-          <w:rFonts w:ascii="IBM Plex Sans" w:cs="IBM Plex Sans" w:eastAsia="IBM Plex Sans" w:hAnsi="IBM Plex Sans"/>
-          <w:rtl w:val="0"/>
-        </w:rPr>
-        <w:t xml:space="preserve">{{EXECUTIVE_SUMMARY}}</w:t>
-      </w:r>
-    </w:p>
-    <w:p>
-      <w:pPr>
         <w:keepNext w:val="0"/>
         <w:keepLines w:val="0"/>
         <w:pageBreakBefore w:val="0"/>
@@ -2878,6 +2912,21 @@
     </w:p>
     <w:p>
       <w:pPr>
+        <w:ind w:left="1440" w:right="1440" w:firstLine="0"/>
+        <w:rPr>
+          <w:rFonts w:ascii="IBM Plex Sans" w:cs="IBM Plex Sans" w:eastAsia="IBM Plex Sans" w:hAnsi="IBM Plex Sans"/>
+          <w:sz w:val="28"/>
+          <w:szCs w:val="28"/>
+        </w:rPr>
+      </w:pPr>
+      <w:r>
+        <w:rPr>
+          <w:rtl w:val="0"/>
+        </w:rPr>
+      </w:r>
+    </w:p>
+    <w:p>
+      <w:pPr>
         <w:keepNext w:val="0"/>
         <w:keepLines w:val="0"/>
         <w:pageBreakBefore w:val="0"/>
@@ -2905,93 +2954,6 @@
           <w:sz w:val="28"/>
           <w:szCs w:val="28"/>
         </w:rPr>
-      </w:pPr>
-      <w:r>
-        <w:rPr>
-          <w:rtl w:val="0"/>
-        </w:rPr>
-      </w:r>
-    </w:p>
-    <w:p>
-      <w:pPr>
-        <w:ind w:left="1440" w:right="1440" w:firstLine="0"/>
-        <w:rPr>
-          <w:rFonts w:ascii="IBM Plex Sans" w:cs="IBM Plex Sans" w:eastAsia="IBM Plex Sans" w:hAnsi="IBM Plex Sans"/>
-          <w:sz w:val="28"/>
-          <w:szCs w:val="28"/>
-        </w:rPr>
-      </w:pPr>
-      <w:r>
-        <w:rPr>
-          <w:rtl w:val="0"/>
-        </w:rPr>
-      </w:r>
-    </w:p>
-    <w:p>
-      <w:pPr>
-        <w:keepNext w:val="0"/>
-        <w:keepLines w:val="0"/>
-        <w:pageBreakBefore w:val="0"/>
-        <w:widowControl w:val="0"/>
-        <w:pBdr>
-          <w:top w:space="0" w:sz="0" w:val="nil"/>
-          <w:left w:space="0" w:sz="0" w:val="nil"/>
-          <w:bottom w:space="0" w:sz="0" w:val="nil"/>
-          <w:right w:space="0" w:sz="0" w:val="nil"/>
-          <w:between w:space="0" w:sz="0" w:val="nil"/>
-        </w:pBdr>
-        <w:shd w:fill="auto" w:val="clear"/>
-        <w:tabs>
-          <w:tab w:val="left" w:leader="none" w:pos="3391"/>
-          <w:tab w:val="left" w:leader="none" w:pos="6257"/>
-          <w:tab w:val="left" w:leader="none" w:pos="6971"/>
-          <w:tab w:val="left" w:leader="none" w:pos="7944"/>
-          <w:tab w:val="left" w:leader="none" w:pos="9060"/>
-        </w:tabs>
-        <w:spacing w:after="0" w:before="159" w:line="271" w:lineRule="auto"/>
-        <w:ind w:left="0" w:right="1440" w:firstLine="0"/>
-        <w:jc w:val="both"/>
-        <w:rPr>
-          <w:rFonts w:ascii="IBM Plex Sans" w:cs="IBM Plex Sans" w:eastAsia="IBM Plex Sans" w:hAnsi="IBM Plex Sans"/>
-          <w:sz w:val="28"/>
-          <w:szCs w:val="28"/>
-        </w:rPr>
-      </w:pPr>
-      <w:r>
-        <w:rPr>
-          <w:rtl w:val="0"/>
-        </w:rPr>
-      </w:r>
-    </w:p>
-    <w:p>
-      <w:pPr>
-        <w:keepNext w:val="0"/>
-        <w:keepLines w:val="0"/>
-        <w:pageBreakBefore w:val="0"/>
-        <w:widowControl w:val="0"/>
-        <w:pBdr>
-          <w:top w:space="0" w:sz="0" w:val="nil"/>
-          <w:left w:space="0" w:sz="0" w:val="nil"/>
-          <w:bottom w:space="0" w:sz="0" w:val="nil"/>
-          <w:right w:space="0" w:sz="0" w:val="nil"/>
-          <w:between w:space="0" w:sz="0" w:val="nil"/>
-        </w:pBdr>
-        <w:shd w:fill="auto" w:val="clear"/>
-        <w:tabs>
-          <w:tab w:val="left" w:leader="none" w:pos="3391"/>
-          <w:tab w:val="left" w:leader="none" w:pos="6257"/>
-          <w:tab w:val="left" w:leader="none" w:pos="6971"/>
-          <w:tab w:val="left" w:leader="none" w:pos="7944"/>
-          <w:tab w:val="left" w:leader="none" w:pos="9060"/>
-        </w:tabs>
-        <w:spacing w:after="0" w:before="159" w:line="271" w:lineRule="auto"/>
-        <w:ind w:left="0" w:right="1440" w:firstLine="0"/>
-        <w:jc w:val="both"/>
-        <w:rPr>
-          <w:rFonts w:ascii="IBM Plex Sans" w:cs="IBM Plex Sans" w:eastAsia="IBM Plex Sans" w:hAnsi="IBM Plex Sans"/>
-          <w:sz w:val="28"/>
-          <w:szCs w:val="28"/>
-        </w:rPr>
         <w:sectPr>
           <w:type w:val="nextPage"/>
           <w:pgSz w:h="15840" w:w="12240" w:orient="portrait"/>
@@ -3061,11 +3023,6 @@
         </w:rPr>
         <w:t xml:space="preserve">{{FINDINGS_SUMMARY}}</w:t>
       </w:r>
-      <w:r>
-        <w:rPr>
-          <w:rtl w:val="0"/>
-        </w:rPr>
-      </w:r>
     </w:p>
     <w:p>
       <w:pPr>
@@ -3089,7 +3046,7 @@
     <w:sdt>
       <w:sdtPr>
         <w:lock w:val="contentLocked"/>
-        <w:id w:val="581611418"/>
+        <w:id w:val="1657988574"/>
         <w:tag w:val="goog_rdk_0"/>
       </w:sdtPr>
       <w:sdtContent>
@@ -3605,7 +3562,6 @@
         <w:ind w:left="1440" w:hanging="360"/>
         <w:rPr>
           <w:rFonts w:ascii="IBM Plex Sans" w:cs="IBM Plex Sans" w:eastAsia="IBM Plex Sans" w:hAnsi="IBM Plex Sans"/>
-          <w:u w:val="none"/>
         </w:rPr>
       </w:pPr>
       <w:r>
@@ -3677,7 +3633,7 @@
           <w:rFonts w:ascii="IBM Plex Sans" w:cs="IBM Plex Sans" w:eastAsia="IBM Plex Sans" w:hAnsi="IBM Plex Sans"/>
           <w:rtl w:val="0"/>
         </w:rPr>
-        <w:t xml:space="preserve">The AI hacker agent employs a multi-layered approach to security assessment, integrating industry-standard tools and advanced red teaming techniques. Initial reconnaissance utilizes Amass, Gau, and Katana for comprehensive attack surface mapping, while DNSRecon and ProjectDiscovery-httpx identify subdomains and active services. Vulnerability discovery focuses on web application flaws such as SQL injection, Cross-Site Scripting (XSS), and Broken Access Control, utilizing SQLmap, XSStrike, Dalfox, and JWT_tool. For API security, Schemathesis performs property-based testing against defined schemas. Infrastructure assessments leverage NetExec, SMBMap, and Enum4linux to identify misconfigurations in network services, while Kerbrute and BloodyAD facilitate Active Directory enumeration and credential-based attacks like Kerberoasting.</w:t>
+        <w:t xml:space="preserve">Initial reconnaissance utilizes Amass, Gau, and Katana for comprehensive attack surface mapping, while DNSRecon and ProjectDiscovery-httpx identify subdomains and active services. Vulnerability discovery focuses on web application flaws such as SQL injection, Cross-Site Scripting (XSS), and Broken Access Control, utilizing SQLmap, XSStrike, Dalfox, and JWT_tool. For API security, Schemathesis performs property-based testing against defined schemas. Infrastructure assessments leverage NetExec, SMBMap, and Enum4linux to identify misconfigurations in network services, while Kerbrute and BloodyAD facilitate Active Directory enumeration and credential-based attacks like Kerberoasting.</w:t>
       </w:r>
     </w:p>
     <w:p>
@@ -3759,7 +3715,7 @@
     <w:sdt>
       <w:sdtPr>
         <w:lock w:val="contentLocked"/>
-        <w:id w:val="631287952"/>
+        <w:id w:val="-1227396979"/>
         <w:tag w:val="goog_rdk_1"/>
       </w:sdtPr>
       <w:sdtContent>
@@ -5754,6 +5710,79 @@
           <w:rtl w:val="0"/>
         </w:rPr>
         <w:t xml:space="preserve">Vulnerability may result in limited exposure of application control, sensitive business and customer data, or system information. This type of issue provides value only when combined with one or more issues of a higher risk classification. Examples include overly detailed error messages, the disclosure of system versioning information, and minor reliability issues.</w:t>
+      </w:r>
+    </w:p>
+    <w:p>
+      <w:pPr>
+        <w:spacing w:line="271" w:lineRule="auto"/>
+        <w:ind w:left="1440" w:right="1440" w:firstLine="0"/>
+        <w:jc w:val="both"/>
+        <w:rPr>
+          <w:rFonts w:ascii="IBM Plex Sans" w:cs="IBM Plex Sans" w:eastAsia="IBM Plex Sans" w:hAnsi="IBM Plex Sans"/>
+        </w:rPr>
+      </w:pPr>
+      <w:r>
+        <w:rPr>
+          <w:rtl w:val="0"/>
+        </w:rPr>
+      </w:r>
+    </w:p>
+    <w:p>
+      <w:pPr>
+        <w:spacing w:line="271" w:lineRule="auto"/>
+        <w:ind w:left="1440" w:right="1440" w:firstLine="0"/>
+        <w:jc w:val="both"/>
+        <w:rPr>
+          <w:rFonts w:ascii="IBM Plex Sans" w:cs="IBM Plex Sans" w:eastAsia="IBM Plex Sans" w:hAnsi="IBM Plex Sans"/>
+        </w:rPr>
+      </w:pPr>
+      <w:r>
+        <w:rPr>
+          <w:rtl w:val="0"/>
+        </w:rPr>
+      </w:r>
+    </w:p>
+    <w:p>
+      <w:pPr>
+        <w:ind w:left="720" w:right="1440" w:firstLine="720"/>
+        <w:rPr>
+          <w:rFonts w:ascii="IBM Plex Sans" w:cs="IBM Plex Sans" w:eastAsia="IBM Plex Sans" w:hAnsi="IBM Plex Sans"/>
+          <w:color w:val="3c78d8"/>
+          <w:sz w:val="28"/>
+          <w:szCs w:val="28"/>
+        </w:rPr>
+      </w:pPr>
+      <w:r>
+        <w:rPr>
+          <w:rFonts w:ascii="IBM Plex Sans" w:cs="IBM Plex Sans" w:eastAsia="IBM Plex Sans" w:hAnsi="IBM Plex Sans"/>
+          <w:color w:val="3c78d8"/>
+          <w:sz w:val="28"/>
+          <w:szCs w:val="28"/>
+          <w:rtl w:val="0"/>
+        </w:rPr>
+        <w:t xml:space="preserve">Informational</w:t>
+      </w:r>
+    </w:p>
+    <w:p>
+      <w:pPr>
+        <w:spacing w:line="271" w:lineRule="auto"/>
+        <w:ind w:left="1440" w:right="1440" w:firstLine="0"/>
+        <w:jc w:val="both"/>
+        <w:rPr>
+          <w:rFonts w:ascii="IBM Plex Sans" w:cs="IBM Plex Sans" w:eastAsia="IBM Plex Sans" w:hAnsi="IBM Plex Sans"/>
+        </w:rPr>
+      </w:pPr>
+      <w:r>
+        <w:rPr>
+          <w:rFonts w:ascii="IBM Plex Sans" w:cs="IBM Plex Sans" w:eastAsia="IBM Plex Sans" w:hAnsi="IBM Plex Sans"/>
+          <w:rtl w:val="0"/>
+        </w:rPr>
+        <w:t xml:space="preserve">A security-relevant observation that does not present a direct, exploitable risk on its own but is worth noting for defense-in-depth or hardening purposes.</w:t>
+      </w:r>
+      <w:r>
+        <w:rPr>
+          <w:rtl w:val="0"/>
+        </w:rPr>
       </w:r>
     </w:p>
     <w:p>
@@ -5994,7 +6023,7 @@
                 <w:color w:val="34d399"/>
                 <w:rtl w:val="0"/>
               </w:rPr>
-              <w:t xml:space="preserve">Risk</w:t>
+              <w:t xml:space="preserve">Likelihood</w:t>
             </w:r>
           </w:p>
         </w:tc>
@@ -7289,121 +7318,8 @@
       </w:rPr>
     </w:lvl>
   </w:abstractNum>
-  <w:abstractNum w:abstractNumId="2">
-    <w:lvl w:ilvl="0">
-      <w:start w:val="1"/>
-      <w:numFmt w:val="bullet"/>
-      <w:lvlText w:val="●"/>
-      <w:lvlJc w:val="left"/>
-      <w:pPr>
-        <w:ind w:left="720" w:hanging="360"/>
-      </w:pPr>
-      <w:rPr>
-        <w:u w:val="none"/>
-      </w:rPr>
-    </w:lvl>
-    <w:lvl w:ilvl="1">
-      <w:start w:val="1"/>
-      <w:numFmt w:val="bullet"/>
-      <w:lvlText w:val="○"/>
-      <w:lvlJc w:val="left"/>
-      <w:pPr>
-        <w:ind w:left="1440" w:hanging="360"/>
-      </w:pPr>
-      <w:rPr>
-        <w:u w:val="none"/>
-      </w:rPr>
-    </w:lvl>
-    <w:lvl w:ilvl="2">
-      <w:start w:val="1"/>
-      <w:numFmt w:val="bullet"/>
-      <w:lvlText w:val="■"/>
-      <w:lvlJc w:val="left"/>
-      <w:pPr>
-        <w:ind w:left="2160" w:hanging="360"/>
-      </w:pPr>
-      <w:rPr>
-        <w:u w:val="none"/>
-      </w:rPr>
-    </w:lvl>
-    <w:lvl w:ilvl="3">
-      <w:start w:val="1"/>
-      <w:numFmt w:val="bullet"/>
-      <w:lvlText w:val="●"/>
-      <w:lvlJc w:val="left"/>
-      <w:pPr>
-        <w:ind w:left="2880" w:hanging="360"/>
-      </w:pPr>
-      <w:rPr>
-        <w:u w:val="none"/>
-      </w:rPr>
-    </w:lvl>
-    <w:lvl w:ilvl="4">
-      <w:start w:val="1"/>
-      <w:numFmt w:val="bullet"/>
-      <w:lvlText w:val="○"/>
-      <w:lvlJc w:val="left"/>
-      <w:pPr>
-        <w:ind w:left="3600" w:hanging="360"/>
-      </w:pPr>
-      <w:rPr>
-        <w:u w:val="none"/>
-      </w:rPr>
-    </w:lvl>
-    <w:lvl w:ilvl="5">
-      <w:start w:val="1"/>
-      <w:numFmt w:val="bullet"/>
-      <w:lvlText w:val="■"/>
-      <w:lvlJc w:val="left"/>
-      <w:pPr>
-        <w:ind w:left="4320" w:hanging="360"/>
-      </w:pPr>
-      <w:rPr>
-        <w:u w:val="none"/>
-      </w:rPr>
-    </w:lvl>
-    <w:lvl w:ilvl="6">
-      <w:start w:val="1"/>
-      <w:numFmt w:val="bullet"/>
-      <w:lvlText w:val="●"/>
-      <w:lvlJc w:val="left"/>
-      <w:pPr>
-        <w:ind w:left="5040" w:hanging="360"/>
-      </w:pPr>
-      <w:rPr>
-        <w:u w:val="none"/>
-      </w:rPr>
-    </w:lvl>
-    <w:lvl w:ilvl="7">
-      <w:start w:val="1"/>
-      <w:numFmt w:val="bullet"/>
-      <w:lvlText w:val="○"/>
-      <w:lvlJc w:val="left"/>
-      <w:pPr>
-        <w:ind w:left="5760" w:hanging="360"/>
-      </w:pPr>
-      <w:rPr>
-        <w:u w:val="none"/>
-      </w:rPr>
-    </w:lvl>
-    <w:lvl w:ilvl="8">
-      <w:start w:val="1"/>
-      <w:numFmt w:val="bullet"/>
-      <w:lvlText w:val="■"/>
-      <w:lvlJc w:val="left"/>
-      <w:pPr>
-        <w:ind w:left="6480" w:hanging="360"/>
-      </w:pPr>
-      <w:rPr>
-        <w:u w:val="none"/>
-      </w:rPr>
-    </w:lvl>
-  </w:abstractNum>
   <w:num w:numId="1">
     <w:abstractNumId w:val="1"/>
-  </w:num>
-  <w:num w:numId="2">
-    <w:abstractNumId w:val="2"/>
   </w:num>
 </w:numbering>
 </file>
@@ -7546,6 +7462,55 @@
       <w:sz w:val="72"/>
       <w:szCs w:val="72"/>
     </w:rPr>
+  </w:style>
+  <w:style w:type="table" w:styleId="TableNormal" w:default="1">
+    <w:name w:val="TableNormal"/>
+    <w:tblPr>
+      <w:tblCellMar>
+        <w:top w:w="100.0" w:type="dxa"/>
+        <w:left w:w="100.0" w:type="dxa"/>
+        <w:bottom w:w="100.0" w:type="dxa"/>
+        <w:right w:w="100.0" w:type="dxa"/>
+      </w:tblCellMar>
+    </w:tblPr>
+  </w:style>
+  <w:style w:type="paragraph" w:styleId="Normal" w:default="1">
+    <w:name w:val="normal"/>
+  </w:style>
+  <w:style w:type="table" w:styleId="Table1">
+    <w:basedOn w:val="TableNormal"/>
+    <w:tblPr>
+      <w:tblStyleRowBandSize w:val="1"/>
+      <w:tblStyleColBandSize w:val="1"/>
+    </w:tblPr>
+  </w:style>
+  <w:style w:type="table" w:styleId="Table2">
+    <w:basedOn w:val="TableNormal"/>
+    <w:tblPr>
+      <w:tblStyleRowBandSize w:val="1"/>
+      <w:tblStyleColBandSize w:val="1"/>
+    </w:tblPr>
+  </w:style>
+  <w:style w:type="table" w:styleId="Table3">
+    <w:basedOn w:val="TableNormal"/>
+    <w:tblPr>
+      <w:tblStyleRowBandSize w:val="1"/>
+      <w:tblStyleColBandSize w:val="1"/>
+    </w:tblPr>
+  </w:style>
+  <w:style w:type="table" w:styleId="Table4">
+    <w:basedOn w:val="TableNormal"/>
+    <w:tblPr>
+      <w:tblStyleRowBandSize w:val="1"/>
+      <w:tblStyleColBandSize w:val="1"/>
+    </w:tblPr>
+  </w:style>
+  <w:style w:type="table" w:styleId="Table5">
+    <w:basedOn w:val="TableNormal"/>
+    <w:tblPr>
+      <w:tblStyleRowBandSize w:val="1"/>
+      <w:tblStyleColBandSize w:val="1"/>
+    </w:tblPr>
   </w:style>
   <w:style w:type="paragraph" w:styleId="Subtitle">
     <w:name w:val="Subtitle"/>
@@ -7926,7 +7891,7 @@
 
 <file path=customXML/item1.xml><?xml version="1.0" encoding="utf-8"?>
 <go:gDocsCustomXmlDataStorage xmlns:go="http://customooxmlschemas.google.com/" xmlns:r="http://schemas.openxmlformats.org/officeDocument/2006/relationships" uri="GoogleDocsCustomDataVersion2">
-  <go:docsCustomData xmlns:go="http://customooxmlschemas.google.com/" roundtripDataSignature="AMtx7mg1NialLs3nd8FqvhDCdaDdvNGiuA==">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</go:docsCustomData>
+  <go:docsCustomData xmlns:go="http://customooxmlschemas.google.com/" roundtripDataSignature="AMtx7mgIuRH2uJ6m03WNbJfzM+a19WxTFQ==">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</go:docsCustomData>
 </go:gDocsCustomXmlDataStorage>
 </file>
 

</xml_diff>